<commit_message>
Tài liệu khó khăn – giải pháp theo số mới: 43/43, lỗi hết tiền nạp Gemini, chi phí câu có ảnh, buổi dùng thử 34 bạn
Co-Authored-By: Claude Opus 5.5 <noreply@anthropic.com>
</commit_message>
<xml_diff>
--- a/bao-cao/Kho_khan_va_giai_phap_Mimo.docx
+++ b/bao-cao/Kho_khan_va_giai_phap_Mimo.docx
@@ -46,7 +46,7 @@
           <w:sz w:val="20"/>
           <w:szCs w:val="20"/>
         </w:rPr>
-        <w:t xml:space="preserve">Tài liệu nội bộ để cả nhóm đọc trước buổi thuyết trình · cập nhật sáng 17/10/2026</w:t>
+        <w:t xml:space="preserve">Tài liệu nội bộ để cả nhóm đọc trước buổi thuyết trình · cập nhật 17/10/2026 chiều, sau lần đo cuối trên bản deploy</w:t>
       </w:r>
     </w:p>
     <w:p>
@@ -322,7 +322,25 @@
                 <w:sz w:val="18"/>
                 <w:szCs w:val="18"/>
               </w:rPr>
-              <w:t xml:space="preserve">43 ca, chấm chặt: 42/43 trên bản deploy (17/10, 08:47)</w:t>
+              <w:t xml:space="preserve">43 ca, chấm chặt: </w:t>
+            </w:r>
+            <w:r>
+              <w:rPr>
+                <w:rFonts w:ascii="Arial" w:cs="Arial" w:eastAsia="Arial" w:hAnsi="Arial"/>
+                <w:b/>
+                <w:bCs/>
+                <w:sz w:val="18"/>
+                <w:szCs w:val="18"/>
+              </w:rPr>
+              <w:t xml:space="preserve">43/43</w:t>
+            </w:r>
+            <w:r>
+              <w:rPr>
+                <w:rFonts w:ascii="Arial" w:cs="Arial" w:eastAsia="Arial" w:hAnsi="Arial"/>
+                <w:sz w:val="18"/>
+                <w:szCs w:val="18"/>
+              </w:rPr>
+              <w:t xml:space="preserve"> trên bản deploy cuối (17/10, 15:13); nhóm đọc lại trang trích của cả 43 câu</w:t>
             </w:r>
           </w:p>
         </w:tc>
@@ -515,7 +533,7 @@
                 <w:sz w:val="18"/>
                 <w:szCs w:val="18"/>
               </w:rPr>
-              <w:t xml:space="preserve">28 thầy cô: 25 đúng, 3 có chỗ sai, đã sửa theo góp ý</w:t>
+              <w:t xml:space="preserve">Lần 19/09: 25/28 đúng. Lần 17/10: 41/43 đúng, 2 có chỗ sai, đã sửa trong ngày</w:t>
             </w:r>
           </w:p>
         </w:tc>
@@ -806,7 +824,7 @@
                 <w:sz w:val="18"/>
                 <w:szCs w:val="18"/>
               </w:rPr>
-              <w:t xml:space="preserve">trung vị 3,5 s</w:t>
+              <w:t xml:space="preserve">trung vị 4,1 s ở bộ thử cuối; 3,1 s khi 34 học sinh dùng thử</w:t>
             </w:r>
           </w:p>
         </w:tc>
@@ -901,7 +919,7 @@
                 <w:sz w:val="18"/>
                 <w:szCs w:val="18"/>
               </w:rPr>
-              <w:t xml:space="preserve">có buổi dùng thử và khảo sát; góp ý "lệch trang" đã sửa</w:t>
+              <w:t xml:space="preserve">34 bạn lớp 7, 368 câu (16/10); góp ý "lệch trang" đã sửa: câu bài có trang từ 10/25 lên 18/25</w:t>
             </w:r>
           </w:p>
         </w:tc>
@@ -918,7 +936,7 @@
           <w:sz w:val="18"/>
           <w:szCs w:val="18"/>
         </w:rPr>
-        <w:t xml:space="preserve">Lưu ý khi trình bày: 42/43 không so thẳng được với 27/28 vì bộ mới chấm chặt hơn. Câu chuyện đúng là: chấm chặt làm điểm tụt còn 37/43, rồi nhóm sửa Mimo lên 42/43.</w:t>
+        <w:t xml:space="preserve">Lưu ý khi trình bày: 43/43 không so thẳng được với 27/28 vì bộ mới chấm chặt hơn. Câu chuyện đúng là: chấm chặt làm điểm tụt còn 37/43, nhóm sửa Mimo lên 42/43, rồi sửa tiếp theo góp ý của thầy cô (câu 16 ƯCLN, câu 27 "(a+b)² = a² + b²?") và đo lại trên bản deploy cuối được 43/43. Thầy cô chấm lần đo 10:01 (41 đúng, 2 có chỗ sai); lần đo cuối chưa được chấm lại.</w:t>
       </w:r>
     </w:p>
     <w:p>
@@ -4088,7 +4106,533 @@
                 <w:sz w:val="18"/>
                 <w:szCs w:val="18"/>
               </w:rPr>
-              <w:t xml:space="preserve">Dặn trích cho cách làm lấy từ sách, thêm câu trỏ trang dự phòng khi mô hình quên. Chạy thử 3/3 lần có trích dẫn.</w:t>
+              <w:t xml:space="preserve">Dặn trích cho cách làm lấy từ sách, thêm câu trỏ trang dự phòng khi mô hình quên. Lần đo cuối trên bản deploy: đạt, tự trích trang 43.</w:t>
+            </w:r>
+          </w:p>
+        </w:tc>
+      </w:tr>
+      <w:tr>
+        <w:trPr>
+          <w:cantSplit/>
+        </w:trPr>
+        <w:tc>
+          <w:tcPr>
+            <w:tcW w:type="dxa" w:w="1150"/>
+            <w:tcBorders>
+              <w:top w:val="single" w:color="D6D3D1" w:sz="4"/>
+              <w:left w:val="single" w:color="D6D3D1" w:sz="4"/>
+              <w:bottom w:val="single" w:color="D6D3D1" w:sz="4"/>
+              <w:right w:val="single" w:color="D6D3D1" w:sz="4"/>
+            </w:tcBorders>
+            <w:shd w:fill="F8F5F2" w:color="auto" w:val="clear"/>
+            <w:tcMar>
+              <w:top w:type="dxa" w:w="60"/>
+              <w:left w:type="dxa" w:w="100"/>
+              <w:bottom w:type="dxa" w:w="60"/>
+              <w:right w:type="dxa" w:w="100"/>
+            </w:tcMar>
+          </w:tcPr>
+          <w:p>
+            <w:pPr>
+              <w:spacing w:after="40" w:line="264"/>
+            </w:pPr>
+            <w:r>
+              <w:rPr>
+                <w:rFonts w:ascii="Arial" w:cs="Arial" w:eastAsia="Arial" w:hAnsi="Arial"/>
+                <w:sz w:val="18"/>
+                <w:szCs w:val="18"/>
+              </w:rPr>
+              <w:t xml:space="preserve">17/10</w:t>
+            </w:r>
+          </w:p>
+        </w:tc>
+        <w:tc>
+          <w:tcPr>
+            <w:tcW w:type="dxa" w:w="2900"/>
+            <w:tcBorders>
+              <w:top w:val="single" w:color="D6D3D1" w:sz="4"/>
+              <w:left w:val="single" w:color="D6D3D1" w:sz="4"/>
+              <w:bottom w:val="single" w:color="D6D3D1" w:sz="4"/>
+              <w:right w:val="single" w:color="D6D3D1" w:sz="4"/>
+            </w:tcBorders>
+            <w:shd w:fill="F8F5F2" w:color="auto" w:val="clear"/>
+            <w:tcMar>
+              <w:top w:type="dxa" w:w="60"/>
+              <w:left w:type="dxa" w:w="100"/>
+              <w:bottom w:type="dxa" w:w="60"/>
+              <w:right w:type="dxa" w:w="100"/>
+            </w:tcMar>
+          </w:tcPr>
+          <w:p>
+            <w:pPr>
+              <w:spacing w:after="40" w:line="264"/>
+            </w:pPr>
+            <w:r>
+              <w:rPr>
+                <w:rFonts w:ascii="Arial" w:cs="Arial" w:eastAsia="Arial" w:hAnsi="Arial"/>
+                <w:sz w:val="18"/>
+                <w:szCs w:val="18"/>
+              </w:rPr>
+              <w:t xml:space="preserve">Lần đo 09:44 đạt 43/43 nhưng đọc lại thì câu trỏ trang dự phòng trỏ sai ở 5/6 ca năn nỉ ("3/4 + 5/6" → bài Xác suất thực nghiệm).</w:t>
+            </w:r>
+          </w:p>
+        </w:tc>
+        <w:tc>
+          <w:tcPr>
+            <w:tcW w:type="dxa" w:w="2550"/>
+            <w:tcBorders>
+              <w:top w:val="single" w:color="D6D3D1" w:sz="4"/>
+              <w:left w:val="single" w:color="D6D3D1" w:sz="4"/>
+              <w:bottom w:val="single" w:color="D6D3D1" w:sz="4"/>
+              <w:right w:val="single" w:color="D6D3D1" w:sz="4"/>
+            </w:tcBorders>
+            <w:shd w:fill="F8F5F2" w:color="auto" w:val="clear"/>
+            <w:tcMar>
+              <w:top w:type="dxa" w:w="60"/>
+              <w:left w:type="dxa" w:w="100"/>
+              <w:bottom w:type="dxa" w:w="60"/>
+              <w:right w:type="dxa" w:w="100"/>
+            </w:tcMar>
+          </w:tcPr>
+          <w:p>
+            <w:pPr>
+              <w:spacing w:after="40" w:line="264"/>
+            </w:pPr>
+            <w:r>
+              <w:rPr>
+                <w:rFonts w:ascii="Arial" w:cs="Arial" w:eastAsia="Arial" w:hAnsi="Arial"/>
+                <w:sz w:val="18"/>
+                <w:szCs w:val="18"/>
+              </w:rPr>
+              <w:t xml:space="preserve">Lời năn nỉ tìm ra trang bất kỳ; điều kiện "trùng 4 cặp từ" quá lỏng. Máy chấm nhóm năn nỉ không xét trang nên không bắt được.</w:t>
+            </w:r>
+          </w:p>
+        </w:tc>
+        <w:tc>
+          <w:tcPr>
+            <w:tcW w:type="dxa" w:w="3038"/>
+            <w:tcBorders>
+              <w:top w:val="single" w:color="D6D3D1" w:sz="4"/>
+              <w:left w:val="single" w:color="D6D3D1" w:sz="4"/>
+              <w:bottom w:val="single" w:color="D6D3D1" w:sz="4"/>
+              <w:right w:val="single" w:color="D6D3D1" w:sz="4"/>
+            </w:tcBorders>
+            <w:shd w:fill="F8F5F2" w:color="auto" w:val="clear"/>
+            <w:tcMar>
+              <w:top w:type="dxa" w:w="60"/>
+              <w:left w:type="dxa" w:w="100"/>
+              <w:bottom w:type="dxa" w:w="60"/>
+              <w:right w:type="dxa" w:w="100"/>
+            </w:tcMar>
+          </w:tcPr>
+          <w:p>
+            <w:pPr>
+              <w:spacing w:after="40" w:line="264"/>
+            </w:pPr>
+            <w:r>
+              <w:rPr>
+                <w:rFonts w:ascii="Arial" w:cs="Arial" w:eastAsia="Arial" w:hAnsi="Arial"/>
+                <w:sz w:val="18"/>
+                <w:szCs w:val="18"/>
+              </w:rPr>
+              <w:t xml:space="preserve">Chỉ trỏ khi tên bài của trang khớp câu trả lời. Không dùng con số 43/43 đó; đo lại trên bản đã sửa: 42/43, không còn trang sai.</w:t>
+            </w:r>
+          </w:p>
+        </w:tc>
+      </w:tr>
+      <w:tr>
+        <w:trPr>
+          <w:cantSplit/>
+        </w:trPr>
+        <w:tc>
+          <w:tcPr>
+            <w:tcW w:type="dxa" w:w="1150"/>
+            <w:tcBorders>
+              <w:top w:val="single" w:color="D6D3D1" w:sz="4"/>
+              <w:left w:val="single" w:color="D6D3D1" w:sz="4"/>
+              <w:bottom w:val="single" w:color="D6D3D1" w:sz="4"/>
+              <w:right w:val="single" w:color="D6D3D1" w:sz="4"/>
+            </w:tcBorders>
+            <w:tcMar>
+              <w:top w:type="dxa" w:w="60"/>
+              <w:left w:type="dxa" w:w="100"/>
+              <w:bottom w:type="dxa" w:w="60"/>
+              <w:right w:type="dxa" w:w="100"/>
+            </w:tcMar>
+          </w:tcPr>
+          <w:p>
+            <w:pPr>
+              <w:spacing w:after="40" w:line="264"/>
+            </w:pPr>
+            <w:r>
+              <w:rPr>
+                <w:rFonts w:ascii="Arial" w:cs="Arial" w:eastAsia="Arial" w:hAnsi="Arial"/>
+                <w:sz w:val="18"/>
+                <w:szCs w:val="18"/>
+              </w:rPr>
+              <w:t xml:space="preserve">17/10</w:t>
+            </w:r>
+          </w:p>
+        </w:tc>
+        <w:tc>
+          <w:tcPr>
+            <w:tcW w:type="dxa" w:w="2900"/>
+            <w:tcBorders>
+              <w:top w:val="single" w:color="D6D3D1" w:sz="4"/>
+              <w:left w:val="single" w:color="D6D3D1" w:sz="4"/>
+              <w:bottom w:val="single" w:color="D6D3D1" w:sz="4"/>
+              <w:right w:val="single" w:color="D6D3D1" w:sz="4"/>
+            </w:tcBorders>
+            <w:tcMar>
+              <w:top w:type="dxa" w:w="60"/>
+              <w:left w:type="dxa" w:w="100"/>
+              <w:bottom w:type="dxa" w:w="60"/>
+              <w:right w:type="dxa" w:w="100"/>
+            </w:tcMar>
+          </w:tcPr>
+          <w:p>
+            <w:pPr>
+              <w:spacing w:after="40" w:line="264"/>
+            </w:pPr>
+            <w:r>
+              <w:rPr>
+                <w:rFonts w:ascii="Arial" w:cs="Arial" w:eastAsia="Arial" w:hAnsi="Arial"/>
+                <w:sz w:val="18"/>
+                <w:szCs w:val="18"/>
+              </w:rPr>
+              <w:t xml:space="preserve">Thầy cô chấm 43 câu lần đo 17/10: </w:t>
+            </w:r>
+            <w:r>
+              <w:rPr>
+                <w:rFonts w:ascii="Arial" w:cs="Arial" w:eastAsia="Arial" w:hAnsi="Arial"/>
+                <w:b/>
+                <w:bCs/>
+                <w:sz w:val="18"/>
+                <w:szCs w:val="18"/>
+              </w:rPr>
+              <w:t xml:space="preserve">41 đúng, 2 có chỗ sai</w:t>
+            </w:r>
+            <w:r>
+              <w:rPr>
+                <w:rFonts w:ascii="Arial" w:cs="Arial" w:eastAsia="Arial" w:hAnsi="Arial"/>
+                <w:sz w:val="18"/>
+                <w:szCs w:val="18"/>
+              </w:rPr>
+              <w:t xml:space="preserve">. Câu 16 (ƯCLN) viết thẳng 24 = 2³ · 3, thiếu hướng dẫn cách phân tích; câu 27 chỉ bác cái sai, chưa nêu a² + 2ab + b², thiếu trích dẫn.</w:t>
+            </w:r>
+          </w:p>
+        </w:tc>
+        <w:tc>
+          <w:tcPr>
+            <w:tcW w:type="dxa" w:w="2550"/>
+            <w:tcBorders>
+              <w:top w:val="single" w:color="D6D3D1" w:sz="4"/>
+              <w:left w:val="single" w:color="D6D3D1" w:sz="4"/>
+              <w:bottom w:val="single" w:color="D6D3D1" w:sz="4"/>
+              <w:right w:val="single" w:color="D6D3D1" w:sz="4"/>
+            </w:tcBorders>
+            <w:tcMar>
+              <w:top w:type="dxa" w:w="60"/>
+              <w:left w:type="dxa" w:w="100"/>
+              <w:bottom w:type="dxa" w:w="60"/>
+              <w:right w:type="dxa" w:w="100"/>
+            </w:tcMar>
+          </w:tcPr>
+          <w:p>
+            <w:pPr>
+              <w:spacing w:after="40" w:line="264"/>
+            </w:pPr>
+            <w:r>
+              <w:rPr>
+                <w:rFonts w:ascii="Arial" w:cs="Arial" w:eastAsia="Arial" w:hAnsi="Arial"/>
+                <w:sz w:val="18"/>
+                <w:szCs w:val="18"/>
+              </w:rPr>
+              <w:t xml:space="preserve">Luật nằm ở phần prompt mô hình hay bỏ qua; máy chấm chỉ xét có trích dẫn hay không nên không bắt được.</w:t>
+            </w:r>
+          </w:p>
+        </w:tc>
+        <w:tc>
+          <w:tcPr>
+            <w:tcW w:type="dxa" w:w="3038"/>
+            <w:tcBorders>
+              <w:top w:val="single" w:color="D6D3D1" w:sz="4"/>
+              <w:left w:val="single" w:color="D6D3D1" w:sz="4"/>
+              <w:bottom w:val="single" w:color="D6D3D1" w:sz="4"/>
+              <w:right w:val="single" w:color="D6D3D1" w:sz="4"/>
+            </w:tcBorders>
+            <w:tcMar>
+              <w:top w:type="dxa" w:w="60"/>
+              <w:left w:type="dxa" w:w="100"/>
+              <w:bottom w:type="dxa" w:w="60"/>
+              <w:right w:type="dxa" w:w="100"/>
+            </w:tcMar>
+          </w:tcPr>
+          <w:p>
+            <w:pPr>
+              <w:spacing w:after="40" w:line="264"/>
+            </w:pPr>
+            <w:r>
+              <w:rPr>
+                <w:rFonts w:ascii="Arial" w:cs="Arial" w:eastAsia="Arial" w:hAnsi="Arial"/>
+                <w:sz w:val="18"/>
+                <w:szCs w:val="18"/>
+              </w:rPr>
+              <w:t xml:space="preserve">Đưa luật lên mục bắt buộc: câu "Có phải…" phải nói rõ đúng/chưa đúng và nêu kiến thức đúng theo sách; phân tích thừa số nguyên tố phải làm mẫu phép chia liên tiếp. Thử lại: câu 27 2/2, câu 16 3/3. Máy chấm thêm điều kiện "phải có".</w:t>
+            </w:r>
+          </w:p>
+        </w:tc>
+      </w:tr>
+      <w:tr>
+        <w:trPr>
+          <w:cantSplit/>
+        </w:trPr>
+        <w:tc>
+          <w:tcPr>
+            <w:tcW w:type="dxa" w:w="1150"/>
+            <w:tcBorders>
+              <w:top w:val="single" w:color="D6D3D1" w:sz="4"/>
+              <w:left w:val="single" w:color="D6D3D1" w:sz="4"/>
+              <w:bottom w:val="single" w:color="D6D3D1" w:sz="4"/>
+              <w:right w:val="single" w:color="D6D3D1" w:sz="4"/>
+            </w:tcBorders>
+            <w:shd w:fill="F8F5F2" w:color="auto" w:val="clear"/>
+            <w:tcMar>
+              <w:top w:type="dxa" w:w="60"/>
+              <w:left w:type="dxa" w:w="100"/>
+              <w:bottom w:type="dxa" w:w="60"/>
+              <w:right w:type="dxa" w:w="100"/>
+            </w:tcMar>
+          </w:tcPr>
+          <w:p>
+            <w:pPr>
+              <w:spacing w:after="40" w:line="264"/>
+            </w:pPr>
+            <w:r>
+              <w:rPr>
+                <w:rFonts w:ascii="Arial" w:cs="Arial" w:eastAsia="Arial" w:hAnsi="Arial"/>
+                <w:sz w:val="18"/>
+                <w:szCs w:val="18"/>
+              </w:rPr>
+              <w:t xml:space="preserve">17/10</w:t>
+            </w:r>
+          </w:p>
+        </w:tc>
+        <w:tc>
+          <w:tcPr>
+            <w:tcW w:type="dxa" w:w="2900"/>
+            <w:tcBorders>
+              <w:top w:val="single" w:color="D6D3D1" w:sz="4"/>
+              <w:left w:val="single" w:color="D6D3D1" w:sz="4"/>
+              <w:bottom w:val="single" w:color="D6D3D1" w:sz="4"/>
+              <w:right w:val="single" w:color="D6D3D1" w:sz="4"/>
+            </w:tcBorders>
+            <w:shd w:fill="F8F5F2" w:color="auto" w:val="clear"/>
+            <w:tcMar>
+              <w:top w:type="dxa" w:w="60"/>
+              <w:left w:type="dxa" w:w="100"/>
+              <w:bottom w:type="dxa" w:w="60"/>
+              <w:right w:type="dxa" w:w="100"/>
+            </w:tcMar>
+          </w:tcPr>
+          <w:p>
+            <w:pPr>
+              <w:spacing w:after="40" w:line="264"/>
+            </w:pPr>
+            <w:r>
+              <w:rPr>
+                <w:rFonts w:ascii="Arial" w:cs="Arial" w:eastAsia="Arial" w:hAnsi="Arial"/>
+                <w:sz w:val="18"/>
+                <w:szCs w:val="18"/>
+              </w:rPr>
+              <w:t xml:space="preserve">Gemini báo hết tiền nạp trước (lỗi 402): mọi câu cần tra sách đều báo "chưa mở được sách" trong khi /api/health vẫn xanh.</w:t>
+            </w:r>
+          </w:p>
+        </w:tc>
+        <w:tc>
+          <w:tcPr>
+            <w:tcW w:type="dxa" w:w="2550"/>
+            <w:tcBorders>
+              <w:top w:val="single" w:color="D6D3D1" w:sz="4"/>
+              <w:left w:val="single" w:color="D6D3D1" w:sz="4"/>
+              <w:bottom w:val="single" w:color="D6D3D1" w:sz="4"/>
+              <w:right w:val="single" w:color="D6D3D1" w:sz="4"/>
+            </w:tcBorders>
+            <w:shd w:fill="F8F5F2" w:color="auto" w:val="clear"/>
+            <w:tcMar>
+              <w:top w:type="dxa" w:w="60"/>
+              <w:left w:type="dxa" w:w="100"/>
+              <w:bottom w:type="dxa" w:w="60"/>
+              <w:right w:type="dxa" w:w="100"/>
+            </w:tcMar>
+          </w:tcPr>
+          <w:p>
+            <w:pPr>
+              <w:spacing w:after="40" w:line="264"/>
+            </w:pPr>
+            <w:r>
+              <w:rPr>
+                <w:rFonts w:ascii="Arial" w:cs="Arial" w:eastAsia="Arial" w:hAnsi="Arial"/>
+                <w:sz w:val="18"/>
+                <w:szCs w:val="18"/>
+              </w:rPr>
+              <w:t xml:space="preserve">Số dư nạp trước của project Gemini đã hết, khác với trần chi tiêu tháng gặp ngày 16/10.</w:t>
+            </w:r>
+          </w:p>
+        </w:tc>
+        <w:tc>
+          <w:tcPr>
+            <w:tcW w:type="dxa" w:w="3038"/>
+            <w:tcBorders>
+              <w:top w:val="single" w:color="D6D3D1" w:sz="4"/>
+              <w:left w:val="single" w:color="D6D3D1" w:sz="4"/>
+              <w:bottom w:val="single" w:color="D6D3D1" w:sz="4"/>
+              <w:right w:val="single" w:color="D6D3D1" w:sz="4"/>
+            </w:tcBorders>
+            <w:shd w:fill="F8F5F2" w:color="auto" w:val="clear"/>
+            <w:tcMar>
+              <w:top w:type="dxa" w:w="60"/>
+              <w:left w:type="dxa" w:w="100"/>
+              <w:bottom w:type="dxa" w:w="60"/>
+              <w:right w:type="dxa" w:w="100"/>
+            </w:tcMar>
+          </w:tcPr>
+          <w:p>
+            <w:pPr>
+              <w:spacing w:after="40" w:line="264"/>
+            </w:pPr>
+            <w:r>
+              <w:rPr>
+                <w:rFonts w:ascii="Arial" w:cs="Arial" w:eastAsia="Arial" w:hAnsi="Arial"/>
+                <w:sz w:val="18"/>
+                <w:szCs w:val="18"/>
+              </w:rPr>
+              <w:t xml:space="preserve">Nạp thêm; /api/health/probe gọi thật Gemini nên bắt được lỗi này. Thêm bước xem số dư nạp trước vào danh sách chuẩn bị trước giờ thi.</w:t>
+            </w:r>
+          </w:p>
+        </w:tc>
+      </w:tr>
+      <w:tr>
+        <w:trPr>
+          <w:cantSplit/>
+        </w:trPr>
+        <w:tc>
+          <w:tcPr>
+            <w:tcW w:type="dxa" w:w="1150"/>
+            <w:tcBorders>
+              <w:top w:val="single" w:color="D6D3D1" w:sz="4"/>
+              <w:left w:val="single" w:color="D6D3D1" w:sz="4"/>
+              <w:bottom w:val="single" w:color="D6D3D1" w:sz="4"/>
+              <w:right w:val="single" w:color="D6D3D1" w:sz="4"/>
+            </w:tcBorders>
+            <w:tcMar>
+              <w:top w:type="dxa" w:w="60"/>
+              <w:left w:type="dxa" w:w="100"/>
+              <w:bottom w:type="dxa" w:w="60"/>
+              <w:right w:type="dxa" w:w="100"/>
+            </w:tcMar>
+          </w:tcPr>
+          <w:p>
+            <w:pPr>
+              <w:spacing w:after="40" w:line="264"/>
+            </w:pPr>
+            <w:r>
+              <w:rPr>
+                <w:rFonts w:ascii="Arial" w:cs="Arial" w:eastAsia="Arial" w:hAnsi="Arial"/>
+                <w:sz w:val="18"/>
+                <w:szCs w:val="18"/>
+              </w:rPr>
+              <w:t xml:space="preserve">17/10</w:t>
+            </w:r>
+          </w:p>
+        </w:tc>
+        <w:tc>
+          <w:tcPr>
+            <w:tcW w:type="dxa" w:w="2900"/>
+            <w:tcBorders>
+              <w:top w:val="single" w:color="D6D3D1" w:sz="4"/>
+              <w:left w:val="single" w:color="D6D3D1" w:sz="4"/>
+              <w:bottom w:val="single" w:color="D6D3D1" w:sz="4"/>
+              <w:right w:val="single" w:color="D6D3D1" w:sz="4"/>
+            </w:tcBorders>
+            <w:tcMar>
+              <w:top w:type="dxa" w:w="60"/>
+              <w:left w:type="dxa" w:w="100"/>
+              <w:bottom w:type="dxa" w:w="60"/>
+              <w:right w:type="dxa" w:w="100"/>
+            </w:tcMar>
+          </w:tcPr>
+          <w:p>
+            <w:pPr>
+              <w:spacing w:after="40" w:line="264"/>
+            </w:pPr>
+            <w:r>
+              <w:rPr>
+                <w:rFonts w:ascii="Arial" w:cs="Arial" w:eastAsia="Arial" w:hAnsi="Arial"/>
+                <w:sz w:val="18"/>
+                <w:szCs w:val="18"/>
+              </w:rPr>
+              <w:t xml:space="preserve">Câu có ảnh đề tốn khoảng 1.000 đồng, gấp khoảng 20 lần câu hỏi bằng chữ (khoảng 51 đồng, đo thật trên 37 câu); ảnh nhoè thì Mimo đoán đề.</w:t>
+            </w:r>
+          </w:p>
+        </w:tc>
+        <w:tc>
+          <w:tcPr>
+            <w:tcW w:type="dxa" w:w="2550"/>
+            <w:tcBorders>
+              <w:top w:val="single" w:color="D6D3D1" w:sz="4"/>
+              <w:left w:val="single" w:color="D6D3D1" w:sz="4"/>
+              <w:bottom w:val="single" w:color="D6D3D1" w:sz="4"/>
+              <w:right w:val="single" w:color="D6D3D1" w:sz="4"/>
+            </w:tcBorders>
+            <w:tcMar>
+              <w:top w:type="dxa" w:w="60"/>
+              <w:left w:type="dxa" w:w="100"/>
+              <w:bottom w:type="dxa" w:w="60"/>
+              <w:right w:type="dxa" w:w="100"/>
+            </w:tcMar>
+          </w:tcPr>
+          <w:p>
+            <w:pPr>
+              <w:spacing w:after="40" w:line="264"/>
+            </w:pPr>
+            <w:r>
+              <w:rPr>
+                <w:rFonts w:ascii="Arial" w:cs="Arial" w:eastAsia="Arial" w:hAnsi="Arial"/>
+                <w:sz w:val="18"/>
+                <w:szCs w:val="18"/>
+              </w:rPr>
+              <w:t xml:space="preserve">Câu có ảnh dùng mô hình đọc ảnh đắt hơn và gửi kèm cả trang sách.</w:t>
+            </w:r>
+          </w:p>
+        </w:tc>
+        <w:tc>
+          <w:tcPr>
+            <w:tcW w:type="dxa" w:w="3038"/>
+            <w:tcBorders>
+              <w:top w:val="single" w:color="D6D3D1" w:sz="4"/>
+              <w:left w:val="single" w:color="D6D3D1" w:sz="4"/>
+              <w:bottom w:val="single" w:color="D6D3D1" w:sz="4"/>
+              <w:right w:val="single" w:color="D6D3D1" w:sz="4"/>
+            </w:tcBorders>
+            <w:tcMar>
+              <w:top w:type="dxa" w:w="60"/>
+              <w:left w:type="dxa" w:w="100"/>
+              <w:bottom w:type="dxa" w:w="60"/>
+              <w:right w:type="dxa" w:w="100"/>
+            </w:tcMar>
+          </w:tcPr>
+          <w:p>
+            <w:pPr>
+              <w:spacing w:after="40" w:line="264"/>
+            </w:pPr>
+            <w:r>
+              <w:rPr>
+                <w:rFonts w:ascii="Arial" w:cs="Arial" w:eastAsia="Arial" w:hAnsi="Arial"/>
+                <w:sz w:val="18"/>
+                <w:szCs w:val="18"/>
+              </w:rPr>
+              <w:t xml:space="preserve">Ảnh nhoè thì Mimo nhờ chụp lại; chữ kèm ảnh chung chung thì không đính trang sách; mỗi em tối đa 10 ảnh/ngày. Lượt sau Mimo vẫn nhớ đề trong ảnh.</w:t>
             </w:r>
           </w:p>
         </w:tc>
@@ -4336,6 +4880,34 @@
           <w:sz w:val="20"/>
           <w:szCs w:val="20"/>
         </w:rPr>
+        <w:t xml:space="preserve">Đạt máy chấm chưa chắc đã đúng.</w:t>
+      </w:r>
+      <w:r>
+        <w:rPr>
+          <w:rFonts w:ascii="Arial" w:cs="Arial" w:eastAsia="Arial" w:hAnsi="Arial"/>
+          <w:sz w:val="20"/>
+          <w:szCs w:val="20"/>
+        </w:rPr>
+        <w:t xml:space="preserve"> Lần đo 43/43 sáng 17/10 vẫn có trang trích sai; phải đọc tận câu trả lời, và thầy cô chấm kiến thức là không thay được.</w:t>
+      </w:r>
+    </w:p>
+    <w:p>
+      <w:pPr>
+        <w:pStyle w:val="ListParagraph"/>
+        <w:numPr>
+          <w:ilvl w:val="0"/>
+          <w:numId w:val="2"/>
+        </w:numPr>
+        <w:spacing w:after="80" w:line="276"/>
+      </w:pPr>
+      <w:r>
+        <w:rPr>
+          <w:rFonts w:ascii="Arial" w:cs="Arial" w:eastAsia="Arial" w:hAnsi="Arial"/>
+          <w:b/>
+          <w:bCs/>
+          <w:sz w:val="20"/>
+          <w:szCs w:val="20"/>
+        </w:rPr>
         <w:t xml:space="preserve">Lắng nghe người dùng thật.</w:t>
       </w:r>
       <w:r>
@@ -4741,7 +5313,7 @@
                 <w:sz w:val="18"/>
                 <w:szCs w:val="18"/>
               </w:rPr>
-              <w:t xml:space="preserve">Thầy cô mới chấm bản rút gọn của lần 19/09, mỗi câu một người.</w:t>
+              <w:t xml:space="preserve">Lần đo cuối (43/43) chưa được thầy cô chấm lại; mỗi câu mới có một thầy cô chấm.</w:t>
             </w:r>
           </w:p>
         </w:tc>
@@ -4771,7 +5343,7 @@
                 <w:sz w:val="18"/>
                 <w:szCs w:val="18"/>
               </w:rPr>
-              <w:t xml:space="preserve">Phiếu nguyên văn (kèm số trang) đang chờ chấm; lần sau mỗi câu hai thầy cô để đối chiếu.</w:t>
+              <w:t xml:space="preserve">Gửi phiếu lần đo cuối để chấm lại; lần sau mỗi câu hai thầy cô để đối chiếu.</w:t>
             </w:r>
           </w:p>
         </w:tc>

</xml_diff>